<commit_message>
Align Ohira dual affiliation and update corresponding author email to m211039@fmu.ac.jp.
Match PDS manuscript author block format in SStE submission package and sync CITATION.cff.

Co-authored-by: Cursor <cursoragent@cursor.com>
</commit_message>
<xml_diff>
--- a/04_Manuscripts/submission_package_SStE/CoverLetter_SStE.docx
+++ b/04_Manuscripts/submission_package_SStE/CoverLetter_SStE.docx
@@ -234,7 +234,7 @@
           <w:b w:val="0"/>
           <w:sz w:val="22"/>
         </w:rPr>
-        <w:t>Email: haruki00430@gmail.com</w:t>
+        <w:t>Email: m211039@fmu.ac.jp</w:t>
       </w:r>
     </w:p>
     <w:p>
@@ -261,7 +261,7 @@
           <w:b w:val="0"/>
           <w:sz w:val="22"/>
         </w:rPr>
-        <w:t>Department of Epidemiology</w:t>
+        <w:t>Department of Epidemiology, Fukushima Medical University School of Medicine</w:t>
       </w:r>
     </w:p>
     <w:p>
@@ -270,7 +270,7 @@
           <w:b w:val="0"/>
           <w:sz w:val="22"/>
         </w:rPr>
-        <w:t>Fukushima Medical University School of Medicine</w:t>
+        <w:t>Radiation Medical Science Center for the Fukushima Health Management Survey, Fukushima Medical University</w:t>
       </w:r>
     </w:p>
     <w:p>

</xml_diff>